<commit_message>
Fix: fehlendes "Jahren" nach {{LAUFZEIT}} in mehreren Vorlagen
Im Satz "Die Mindestlaufzeit {{LAUFZEIT}} beginnt mit dem Betriebsbeginn" fehlte nach dem Platzhalter das Wort "Jahren". Betroffen waren: AMBA_Vollbetrieb_mit_Strom_Vorlage.docx, AMBA_Vollbetrieb_ohne_Strom_Vorlage.docx (durch vom Nutzer bereitgestellte, bereits korrigierte Vorlagen ersetzt), sowie Betreibervertrag_AO_Strom_Limares_Wohnkompanie_Vorlage.docx, Betreibervertrag_AO_GWG_Seepark_Vorlage.docx, Betreibervertrag_LBBW_Park_Trio_Vorlage.docx, Betreibervertrag_AO_Strom_GSW_Reutlingen_Vorlage.docx, Betreibervertrag_AO_Strom_Lerner_sches_Schloss_Vorlage.docx und Betreibervertrag_AO_Strom_FerdinandHapp_Vorlage.docx (Wort "Jahren" direkt nach dem Platzhalter ergaenzt). Alle uebrigen Vorlagen im Repository wurden geprueft und enthielten das Wort "Jahren" bereits korrekt.

Co-Authored-By: Claude Sonnet 5 <noreply@anthropic.com>
Claude-Session: https://claude.ai/code/session_016nfePLq8XBNUcRWmhYtqk6
</commit_message>
<xml_diff>
--- a/AMBA_Vollbetrieb_mit_Strom_Vorlage.docx
+++ b/AMBA_Vollbetrieb_mit_Strom_Vorlage.docx
@@ -4480,14 +4480,14 @@
           <w:rFonts w:cstheme="majorHAnsi"/>
           <w:szCs w:val="20"/>
         </w:rPr>
-        <w:t xml:space="preserve"> Maß</w:t>
-      </w:r>
-      <w:r>
-        <w:rPr>
-          <w:rFonts w:cstheme="majorHAnsi"/>
-          <w:szCs w:val="20"/>
-        </w:rPr>
-        <w:t>nahmendefinition</w:t>
+        <w:t xml:space="preserve"> </w:t>
+      </w:r>
+      <w:r>
+        <w:rPr>
+          <w:rFonts w:cstheme="majorHAnsi"/>
+          <w:szCs w:val="20"/>
+        </w:rPr>
+        <w:t>Maßnahmendefinition</w:t>
       </w:r>
       <w:r>
         <w:rPr>
@@ -6683,10 +6683,10 @@
         </w:rPr>
       </w:pPr>
       <w:r>
-        <w:t>Kann eine Vertragspartei ihre Leistungen aufgrund von Umständen nicht oder nur mit unverhältnismäßigem Aufwand erbringen, die außerhalb ihres Einflussbereichs liegen und auch bei Anwendung zumutbarer Sorgfalt nicht vermeidbar sind (insbesondere höhere Gewalt wie Naturkatastrophen, Krieg, Arbeitskampfmaßnahmen oder behördliche Anordnungen), ruhen die betroffenen Leistungspflichten für die Dauer der Beeinträchtigung. Die Parteien werden sich gegenseitig unverzüglich über das Vor</w:t>
-      </w:r>
-      <w:r>
-        <w:t>liegen und die voraussichtliche Dauer solcher Umstände informieren</w:t>
+        <w:t xml:space="preserve">Kann eine Vertragspartei ihre Leistungen aufgrund von Umständen nicht oder nur mit unverhältnismäßigem Aufwand erbringen, die außerhalb ihres Einflussbereichs liegen und auch bei Anwendung zumutbarer Sorgfalt nicht vermeidbar sind (insbesondere höhere Gewalt wie Naturkatastrophen, Krieg, Arbeitskampfmaßnahmen oder behördliche Anordnungen), ruhen die betroffenen Leistungspflichten für die Dauer der Beeinträchtigung. Die Parteien werden sich gegenseitig unverzüglich über das </w:t>
+      </w:r>
+      <w:r>
+        <w:t>Vorliegen und die voraussichtliche Dauer solcher Umstände informieren</w:t>
       </w:r>
       <w:r>
         <w:rPr>
@@ -6873,7 +6873,13 @@
         </w:rPr>
       </w:pPr>
       <w:r>
-        <w:t>Der Vertrag beginnt mit beidseitiger Unterzeichnung. Die Mindestlaufzeit {{LAUFZEIT}} beginnt mit dem Betriebsbeginn</w:t>
+        <w:t>Der Vertrag beginnt mit beidseitiger Unterzeichnung. Die Mindestlaufzeit {{LAUFZEIT}}</w:t>
+      </w:r>
+      <w:r>
+        <w:t xml:space="preserve"> Jahren</w:t>
+      </w:r>
+      <w:r>
+        <w:t xml:space="preserve"> beginnt mit dem Betriebsbeginn</w:t>
       </w:r>
       <w:r>
         <w:t>. Verzögert sich der Betriebsbeginn aus Gründen, die der Betreiber nicht zu vertreten hat – insbesondere wegen fehlender Betriebsbereitschaft der Ladeeinrichtungen oder unvollständiger Vorleistungen des Kunden – verschiebt sich der Betriebsbeginn entsprechend, ohne dass hieraus Ansprüche gegen den Betreiber entstehen</w:t>
@@ -7085,14 +7091,14 @@
           <w:rFonts w:cstheme="majorHAnsi"/>
           <w:szCs w:val="20"/>
         </w:rPr>
-        <w:t>der Kunde mit einer Zahlung aus dem Vertrag in nicht unwesentlicher Höhe in Verzug ist und sei</w:t>
-      </w:r>
-      <w:r>
-        <w:rPr>
-          <w:rFonts w:cstheme="majorHAnsi"/>
-          <w:szCs w:val="20"/>
-        </w:rPr>
-        <w:t xml:space="preserve">ner Zahlungspflicht </w:t>
+        <w:t xml:space="preserve">der Kunde mit einer Zahlung aus dem Vertrag in nicht unwesentlicher Höhe in Verzug ist und </w:t>
+      </w:r>
+      <w:r>
+        <w:rPr>
+          <w:rFonts w:cstheme="majorHAnsi"/>
+          <w:szCs w:val="20"/>
+        </w:rPr>
+        <w:t xml:space="preserve">seiner Zahlungspflicht </w:t>
       </w:r>
       <w:r>
         <w:rPr>
@@ -11459,7 +11465,7 @@
           <w:rFonts w:ascii="Arial" w:eastAsia="Arial" w:hAnsi="Arial" w:cs="Arial"/>
           <w:szCs w:val="20"/>
         </w:rPr>
-        <w:t>Verarbeitungen, die wir auf Art. 6 Abs. 1 lit. e oder lit. f DS-GVO stützen, können Sie aus Gründen, die sich aus Ihrer besonderen Situation ergeben, jederzeit unter Angabe dieser Gründe widersprechen (Art. 21 DS-GVO). Wir werden die personenbezogenen Daten im Falle eines begründeten Widerspruchs nicht mehr für die betreffenden Zwecke verarbeiten, es sei denn, wir können zwingende schutz</w:t>
+        <w:t xml:space="preserve">Verarbeitungen, die wir auf Art. 6 Abs. 1 lit. e oder lit. f DS-GVO stützen, können Sie aus Gründen, die sich aus Ihrer besonderen Situation ergeben, jederzeit unter Angabe dieser Gründe widersprechen (Art. 21 DS-GVO). Wir werden die personenbezogenen Daten im Falle eines begründeten Widerspruchs nicht mehr für die betreffenden Zwecke verarbeiten, es sei denn, wir können zwingende </w:t>
       </w:r>
       <w:r>
         <w:rPr>
@@ -11467,7 +11473,7 @@
           <w:szCs w:val="20"/>
         </w:rPr>
         <w:lastRenderedPageBreak/>
-        <w:t>würdige Gründe für die Verarbeitung nachweisen, die Ihre Interessen, Rechte und Freiheiten überwiegen, oder die Verarbeitung dient der Geltendmachung, Ausübung oder Verteidigung von Rechtsansprüchen.</w:t>
+        <w:t>schutzwürdige Gründe für die Verarbeitung nachweisen, die Ihre Interessen, Rechte und Freiheiten überwiegen, oder die Verarbeitung dient der Geltendmachung, Ausübung oder Verteidigung von Rechtsansprüchen.</w:t>
       </w:r>
     </w:p>
     <w:p>
@@ -16464,6 +16470,26 @@
 </file>
 
 <file path=customXml/item3.xml><?xml version="1.0" encoding="utf-8"?>
+<p:properties xmlns:p="http://schemas.microsoft.com/office/2006/metadata/properties" xmlns:xsi="http://www.w3.org/2001/XMLSchema-instance" xmlns:pc="http://schemas.microsoft.com/office/infopath/2007/PartnerControls">
+  <documentManagement>
+    <lcf76f155ced4ddcb4097134ff3c332f xmlns="8a383c2e-bd54-4902-a119-5b87932b8e96">
+      <Terms xmlns="http://schemas.microsoft.com/office/infopath/2007/PartnerControls"/>
+    </lcf76f155ced4ddcb4097134ff3c332f>
+    <TaxCatchAll xmlns="bb47c008-c9da-4c4d-aa48-f28061b9cf67" xsi:nil="true"/>
+  </documentManagement>
+</p:properties>
+</file>
+
+<file path=customXml/item4.xml><?xml version="1.0" encoding="utf-8"?>
+<?mso-contentType ?>
+<FormTemplates xmlns="http://schemas.microsoft.com/sharepoint/v3/contenttype/forms">
+  <Display>DocumentLibraryForm</Display>
+  <Edit>DocumentLibraryForm</Edit>
+  <New>DocumentLibraryForm</New>
+</FormTemplates>
+</file>
+
+<file path=customXml/item5.xml><?xml version="1.0" encoding="utf-8"?>
 <ct:contentTypeSchema xmlns:ct="http://schemas.microsoft.com/office/2006/metadata/contentType" xmlns:ma="http://schemas.microsoft.com/office/2006/metadata/properties/metaAttributes" ct:_="" ma:_="" ma:contentTypeName="Dokument" ma:contentTypeID="0x010100F51D2DA3021EF44F8FAF5E03764C10C1" ma:contentTypeVersion="18" ma:contentTypeDescription="Ein neues Dokument erstellen." ma:contentTypeScope="" ma:versionID="65ae19aaf4903a9cc4771ccf44afa25a">
   <xsd:schema xmlns:xsd="http://www.w3.org/2001/XMLSchema" xmlns:xs="http://www.w3.org/2001/XMLSchema" xmlns:p="http://schemas.microsoft.com/office/2006/metadata/properties" xmlns:ns2="8a383c2e-bd54-4902-a119-5b87932b8e96" xmlns:ns3="bb47c008-c9da-4c4d-aa48-f28061b9cf67" targetNamespace="http://schemas.microsoft.com/office/2006/metadata/properties" ma:root="true" ma:fieldsID="9ce011545154ca8ef0c23d278cf8cc60" ns2:_="" ns3:_="">
     <xsd:import namespace="8a383c2e-bd54-4902-a119-5b87932b8e96"/>
@@ -16718,26 +16744,6 @@
 </ct:contentTypeSchema>
 </file>
 
-<file path=customXml/item4.xml><?xml version="1.0" encoding="utf-8"?>
-<?mso-contentType ?>
-<FormTemplates xmlns="http://schemas.microsoft.com/sharepoint/v3/contenttype/forms">
-  <Display>DocumentLibraryForm</Display>
-  <Edit>DocumentLibraryForm</Edit>
-  <New>DocumentLibraryForm</New>
-</FormTemplates>
-</file>
-
-<file path=customXml/item5.xml><?xml version="1.0" encoding="utf-8"?>
-<p:properties xmlns:p="http://schemas.microsoft.com/office/2006/metadata/properties" xmlns:xsi="http://www.w3.org/2001/XMLSchema-instance" xmlns:pc="http://schemas.microsoft.com/office/infopath/2007/PartnerControls">
-  <documentManagement>
-    <lcf76f155ced4ddcb4097134ff3c332f xmlns="8a383c2e-bd54-4902-a119-5b87932b8e96">
-      <Terms xmlns="http://schemas.microsoft.com/office/infopath/2007/PartnerControls"/>
-    </lcf76f155ced4ddcb4097134ff3c332f>
-    <TaxCatchAll xmlns="bb47c008-c9da-4c4d-aa48-f28061b9cf67" xsi:nil="true"/>
-  </documentManagement>
-</p:properties>
-</file>
-
 <file path=customXml/itemProps1.xml><?xml version="1.0" encoding="utf-8"?>
 <ds:datastoreItem xmlns:ds="http://schemas.openxmlformats.org/officeDocument/2006/customXml" ds:itemID="{55AF091B-3C7A-41E3-B477-F2FDAA23CFDA}">
   <ds:schemaRefs>
@@ -16755,6 +16761,25 @@
 </file>
 
 <file path=customXml/itemProps3.xml><?xml version="1.0" encoding="utf-8"?>
+<ds:datastoreItem xmlns:ds="http://schemas.openxmlformats.org/officeDocument/2006/customXml" ds:itemID="{F5FA969F-C385-4949-9104-DB878B82F70E}">
+  <ds:schemaRefs>
+    <ds:schemaRef ds:uri="http://schemas.microsoft.com/office/2006/metadata/properties"/>
+    <ds:schemaRef ds:uri="http://schemas.microsoft.com/office/infopath/2007/PartnerControls"/>
+    <ds:schemaRef ds:uri="8a383c2e-bd54-4902-a119-5b87932b8e96"/>
+    <ds:schemaRef ds:uri="bb47c008-c9da-4c4d-aa48-f28061b9cf67"/>
+  </ds:schemaRefs>
+</ds:datastoreItem>
+</file>
+
+<file path=customXml/itemProps4.xml><?xml version="1.0" encoding="utf-8"?>
+<ds:datastoreItem xmlns:ds="http://schemas.openxmlformats.org/officeDocument/2006/customXml" ds:itemID="{846A5F5F-0CE6-4451-8402-A8F05F356EE1}">
+  <ds:schemaRefs>
+    <ds:schemaRef ds:uri="http://schemas.microsoft.com/sharepoint/v3/contenttype/forms"/>
+  </ds:schemaRefs>
+</ds:datastoreItem>
+</file>
+
+<file path=customXml/itemProps5.xml><?xml version="1.0" encoding="utf-8"?>
 <ds:datastoreItem xmlns:ds="http://schemas.openxmlformats.org/officeDocument/2006/customXml" ds:itemID="{495027AE-D16E-4B80-BBAB-C8A394312E4E}">
   <ds:schemaRefs>
     <ds:schemaRef ds:uri="http://schemas.microsoft.com/office/2006/metadata/contentType"/>
@@ -16771,23 +16796,4 @@
     <ds:schemaRef ds:uri="http://schemas.microsoft.com/internal/obd"/>
   </ds:schemaRefs>
 </ds:datastoreItem>
-</file>
-
-<file path=customXml/itemProps4.xml><?xml version="1.0" encoding="utf-8"?>
-<ds:datastoreItem xmlns:ds="http://schemas.openxmlformats.org/officeDocument/2006/customXml" ds:itemID="{846A5F5F-0CE6-4451-8402-A8F05F356EE1}">
-  <ds:schemaRefs>
-    <ds:schemaRef ds:uri="http://schemas.microsoft.com/sharepoint/v3/contenttype/forms"/>
-  </ds:schemaRefs>
-</ds:datastoreItem>
-</file>
-
-<file path=customXml/itemProps5.xml><?xml version="1.0" encoding="utf-8"?>
-<ds:datastoreItem xmlns:ds="http://schemas.openxmlformats.org/officeDocument/2006/customXml" ds:itemID="{F5FA969F-C385-4949-9104-DB878B82F70E}">
-  <ds:schemaRefs>
-    <ds:schemaRef ds:uri="http://schemas.microsoft.com/office/2006/metadata/properties"/>
-    <ds:schemaRef ds:uri="http://schemas.microsoft.com/office/infopath/2007/PartnerControls"/>
-    <ds:schemaRef ds:uri="8a383c2e-bd54-4902-a119-5b87932b8e96"/>
-    <ds:schemaRef ds:uri="bb47c008-c9da-4c4d-aa48-f28061b9cf67"/>
-  </ds:schemaRefs>
-</ds:datastoreItem>
 </file>
</xml_diff>

<commit_message>
Vollbetrieb mit Strom: fehlendes Haekchen bei Punkt j ergaenzt
Bei "j. Automatisierte Abrechnungsfunktion der Ladevorgaenge" war das Kontrollkaestchen nicht angehakt; jetzt als angehakt gesetzt. Sonst unveraendert, Platzhalter geprueft.

Co-Authored-By: Claude Sonnet 5.5 <noreply@anthropic.com>
Claude-Session: https://claude.ai/code/session_016nfePLq8XBNUcRWmhYtqk6
</commit_message>
<xml_diff>
--- a/AMBA_Vollbetrieb_mit_Strom_Vorlage.docx
+++ b/AMBA_Vollbetrieb_mit_Strom_Vorlage.docx
@@ -2480,7 +2480,7 @@
           </w:rPr>
           <w:id w:val="290713364"/>
           <w14:checkbox>
-            <w14:checked w14:val="0"/>
+            <w14:checked w14:val="1"/>
             <w14:checkedState w14:val="0052" w14:font="Wingdings 2"/>
             <w14:uncheckedState w14:val="2610" w14:font="MS Gothic"/>
           </w14:checkbox>
@@ -2489,10 +2489,10 @@
         <w:sdtContent>
           <w:r>
             <w:rPr>
-              <w:rFonts w:ascii="MS Gothic" w:eastAsia="MS Gothic" w:hAnsi="MS Gothic" w:cstheme="majorHAnsi" w:hint="eastAsia"/>
+              <w:rFonts w:cstheme="majorHAnsi"/>
               <w:szCs w:val="20"/>
             </w:rPr>
-            <w:t>☐</w:t>
+            <w:sym w:font="Wingdings 2" w:char="F052"/>
           </w:r>
         </w:sdtContent>
       </w:sdt>
@@ -16470,26 +16470,6 @@
 </file>
 
 <file path=customXml/item3.xml><?xml version="1.0" encoding="utf-8"?>
-<p:properties xmlns:p="http://schemas.microsoft.com/office/2006/metadata/properties" xmlns:xsi="http://www.w3.org/2001/XMLSchema-instance" xmlns:pc="http://schemas.microsoft.com/office/infopath/2007/PartnerControls">
-  <documentManagement>
-    <lcf76f155ced4ddcb4097134ff3c332f xmlns="8a383c2e-bd54-4902-a119-5b87932b8e96">
-      <Terms xmlns="http://schemas.microsoft.com/office/infopath/2007/PartnerControls"/>
-    </lcf76f155ced4ddcb4097134ff3c332f>
-    <TaxCatchAll xmlns="bb47c008-c9da-4c4d-aa48-f28061b9cf67" xsi:nil="true"/>
-  </documentManagement>
-</p:properties>
-</file>
-
-<file path=customXml/item4.xml><?xml version="1.0" encoding="utf-8"?>
-<?mso-contentType ?>
-<FormTemplates xmlns="http://schemas.microsoft.com/sharepoint/v3/contenttype/forms">
-  <Display>DocumentLibraryForm</Display>
-  <Edit>DocumentLibraryForm</Edit>
-  <New>DocumentLibraryForm</New>
-</FormTemplates>
-</file>
-
-<file path=customXml/item5.xml><?xml version="1.0" encoding="utf-8"?>
 <ct:contentTypeSchema xmlns:ct="http://schemas.microsoft.com/office/2006/metadata/contentType" xmlns:ma="http://schemas.microsoft.com/office/2006/metadata/properties/metaAttributes" ct:_="" ma:_="" ma:contentTypeName="Dokument" ma:contentTypeID="0x010100F51D2DA3021EF44F8FAF5E03764C10C1" ma:contentTypeVersion="18" ma:contentTypeDescription="Ein neues Dokument erstellen." ma:contentTypeScope="" ma:versionID="65ae19aaf4903a9cc4771ccf44afa25a">
   <xsd:schema xmlns:xsd="http://www.w3.org/2001/XMLSchema" xmlns:xs="http://www.w3.org/2001/XMLSchema" xmlns:p="http://schemas.microsoft.com/office/2006/metadata/properties" xmlns:ns2="8a383c2e-bd54-4902-a119-5b87932b8e96" xmlns:ns3="bb47c008-c9da-4c4d-aa48-f28061b9cf67" targetNamespace="http://schemas.microsoft.com/office/2006/metadata/properties" ma:root="true" ma:fieldsID="9ce011545154ca8ef0c23d278cf8cc60" ns2:_="" ns3:_="">
     <xsd:import namespace="8a383c2e-bd54-4902-a119-5b87932b8e96"/>
@@ -16744,6 +16724,26 @@
 </ct:contentTypeSchema>
 </file>
 
+<file path=customXml/item4.xml><?xml version="1.0" encoding="utf-8"?>
+<?mso-contentType ?>
+<FormTemplates xmlns="http://schemas.microsoft.com/sharepoint/v3/contenttype/forms">
+  <Display>DocumentLibraryForm</Display>
+  <Edit>DocumentLibraryForm</Edit>
+  <New>DocumentLibraryForm</New>
+</FormTemplates>
+</file>
+
+<file path=customXml/item5.xml><?xml version="1.0" encoding="utf-8"?>
+<p:properties xmlns:p="http://schemas.microsoft.com/office/2006/metadata/properties" xmlns:xsi="http://www.w3.org/2001/XMLSchema-instance" xmlns:pc="http://schemas.microsoft.com/office/infopath/2007/PartnerControls">
+  <documentManagement>
+    <lcf76f155ced4ddcb4097134ff3c332f xmlns="8a383c2e-bd54-4902-a119-5b87932b8e96">
+      <Terms xmlns="http://schemas.microsoft.com/office/infopath/2007/PartnerControls"/>
+    </lcf76f155ced4ddcb4097134ff3c332f>
+    <TaxCatchAll xmlns="bb47c008-c9da-4c4d-aa48-f28061b9cf67" xsi:nil="true"/>
+  </documentManagement>
+</p:properties>
+</file>
+
 <file path=customXml/itemProps1.xml><?xml version="1.0" encoding="utf-8"?>
 <ds:datastoreItem xmlns:ds="http://schemas.openxmlformats.org/officeDocument/2006/customXml" ds:itemID="{55AF091B-3C7A-41E3-B477-F2FDAA23CFDA}">
   <ds:schemaRefs>
@@ -16761,25 +16761,6 @@
 </file>
 
 <file path=customXml/itemProps3.xml><?xml version="1.0" encoding="utf-8"?>
-<ds:datastoreItem xmlns:ds="http://schemas.openxmlformats.org/officeDocument/2006/customXml" ds:itemID="{F5FA969F-C385-4949-9104-DB878B82F70E}">
-  <ds:schemaRefs>
-    <ds:schemaRef ds:uri="http://schemas.microsoft.com/office/2006/metadata/properties"/>
-    <ds:schemaRef ds:uri="http://schemas.microsoft.com/office/infopath/2007/PartnerControls"/>
-    <ds:schemaRef ds:uri="8a383c2e-bd54-4902-a119-5b87932b8e96"/>
-    <ds:schemaRef ds:uri="bb47c008-c9da-4c4d-aa48-f28061b9cf67"/>
-  </ds:schemaRefs>
-</ds:datastoreItem>
-</file>
-
-<file path=customXml/itemProps4.xml><?xml version="1.0" encoding="utf-8"?>
-<ds:datastoreItem xmlns:ds="http://schemas.openxmlformats.org/officeDocument/2006/customXml" ds:itemID="{846A5F5F-0CE6-4451-8402-A8F05F356EE1}">
-  <ds:schemaRefs>
-    <ds:schemaRef ds:uri="http://schemas.microsoft.com/sharepoint/v3/contenttype/forms"/>
-  </ds:schemaRefs>
-</ds:datastoreItem>
-</file>
-
-<file path=customXml/itemProps5.xml><?xml version="1.0" encoding="utf-8"?>
 <ds:datastoreItem xmlns:ds="http://schemas.openxmlformats.org/officeDocument/2006/customXml" ds:itemID="{495027AE-D16E-4B80-BBAB-C8A394312E4E}">
   <ds:schemaRefs>
     <ds:schemaRef ds:uri="http://schemas.microsoft.com/office/2006/metadata/contentType"/>
@@ -16796,4 +16777,23 @@
     <ds:schemaRef ds:uri="http://schemas.microsoft.com/internal/obd"/>
   </ds:schemaRefs>
 </ds:datastoreItem>
+</file>
+
+<file path=customXml/itemProps4.xml><?xml version="1.0" encoding="utf-8"?>
+<ds:datastoreItem xmlns:ds="http://schemas.openxmlformats.org/officeDocument/2006/customXml" ds:itemID="{846A5F5F-0CE6-4451-8402-A8F05F356EE1}">
+  <ds:schemaRefs>
+    <ds:schemaRef ds:uri="http://schemas.microsoft.com/sharepoint/v3/contenttype/forms"/>
+  </ds:schemaRefs>
+</ds:datastoreItem>
+</file>
+
+<file path=customXml/itemProps5.xml><?xml version="1.0" encoding="utf-8"?>
+<ds:datastoreItem xmlns:ds="http://schemas.openxmlformats.org/officeDocument/2006/customXml" ds:itemID="{F5FA969F-C385-4949-9104-DB878B82F70E}">
+  <ds:schemaRefs>
+    <ds:schemaRef ds:uri="http://schemas.microsoft.com/office/2006/metadata/properties"/>
+    <ds:schemaRef ds:uri="http://schemas.microsoft.com/office/infopath/2007/PartnerControls"/>
+    <ds:schemaRef ds:uri="8a383c2e-bd54-4902-a119-5b87932b8e96"/>
+    <ds:schemaRef ds:uri="bb47c008-c9da-4c4d-aa48-f28061b9cf67"/>
+  </ds:schemaRefs>
+</ds:datastoreItem>
 </file>
</xml_diff>